<commit_message>
Brand the IDEs: C/X favicons, app names, new Update Instructions
Custom favicons (scarlet C for cpp, charcoal X for x86) replace
code-server's default tab icon; --app-name sets the branding to
"UNLV C++ IDE" / "UNLV x86 IDE". Update Instructions handouts
regenerated with the current pull/run commands, bind-mount file
safety, and a disk-reclaim step. Closes the backlog branding item.

Co-Authored-By: Claude Fable 5 <noreply@anthropic.com>
</commit_message>
<xml_diff>
--- a/cpp/Design Document.docx
+++ b/cpp/Design Document.docx
@@ -498,34 +498,6 @@
       </w:pPr>
       <w:r>
         <w:rPr>
-          <w:rtl w:val="0"/>
-        </w:rPr>
-      </w:r>
-    </w:p>
-    <w:p>
-      <w:pPr>
-        <w:rPr>
-          <w:rFonts w:ascii="Times New Roman" w:cs="Times New Roman" w:eastAsia="Times New Roman" w:hAnsi="Times New Roman"/>
-          <w:sz w:val="24"/>
-          <w:szCs w:val="24"/>
-        </w:rPr>
-      </w:pPr>
-      <w:r>
-        <w:rPr>
-          <w:rtl w:val="0"/>
-        </w:rPr>
-      </w:r>
-    </w:p>
-    <w:p>
-      <w:pPr>
-        <w:rPr>
-          <w:rFonts w:ascii="Times New Roman" w:cs="Times New Roman" w:eastAsia="Times New Roman" w:hAnsi="Times New Roman"/>
-          <w:sz w:val="24"/>
-          <w:szCs w:val="24"/>
-        </w:rPr>
-      </w:pPr>
-      <w:r>
-        <w:rPr>
           <w:rFonts w:ascii="Times New Roman" w:cs="Times New Roman" w:eastAsia="Times New Roman" w:hAnsi="Times New Roman"/>
           <w:b w:val="1"/>
           <w:bCs w:val="1"/>
@@ -556,7 +528,7 @@
           <w:szCs w:val="24"/>
           <w:rtl w:val="0"/>
         </w:rPr>
-        <w:t xml:space="preserve">Please adhere to the guidelines and terms outlined in the CS 135 course. Here is the link to the chatbot resource.</w:t>
+        <w:t xml:space="preserve">Please adhere to the guidelines and terms outlined in the CS 135 course. Here is the link to the chatbot resource. Always double check with your instructors for AI use. Rules might’ve been changed after creation of this document and usage of this tool might be newly restricted.</w:t>
       </w:r>
     </w:p>
     <w:p>
@@ -748,12 +720,12 @@
           <wp:inline distB="114300" distT="114300" distL="114300" distR="114300">
             <wp:extent cx="5386388" cy="4224425"/>
             <wp:effectExtent b="0" l="0" r="0" t="0"/>
-            <wp:docPr id="8" name="image2.png"/>
+            <wp:docPr id="3" name="image1.png"/>
             <a:graphic>
               <a:graphicData uri="http://schemas.openxmlformats.org/drawingml/2006/picture">
                 <pic:pic>
                   <pic:nvPicPr>
-                    <pic:cNvPr id="0" name="image2.png"/>
+                    <pic:cNvPr id="0" name="image1.png"/>
                     <pic:cNvPicPr preferRelativeResize="0"/>
                   </pic:nvPicPr>
                   <pic:blipFill>
@@ -933,7 +905,7 @@
           <wp:inline distB="114300" distT="114300" distL="114300" distR="114300">
             <wp:extent cx="5595938" cy="3989696"/>
             <wp:effectExtent b="0" l="0" r="0" t="0"/>
-            <wp:docPr id="10" name="image4.png"/>
+            <wp:docPr id="5" name="image4.png"/>
             <a:graphic>
               <a:graphicData uri="http://schemas.openxmlformats.org/drawingml/2006/picture">
                 <pic:pic>
@@ -1054,7 +1026,7 @@
           <w:rtl w:val="0"/>
         </w:rPr>
         <w:br w:type="textWrapping"/>
-        <w:t xml:space="preserve">docker run -it -p 127.0.0.1:8080:8080 -v cs135_data:/home/coder/CS135 seancnc/unlv-cs-ide</w:t>
+        <w:t xml:space="preserve">docker run -it --name unlv-cpp-ide -p 127.0.0.1:8135:8080 -v "$HOME/UNLV/cpp-workspace:/home/coder/workspace" seancnc/unlv-cpp-ide</w:t>
       </w:r>
     </w:p>
     <w:p>
@@ -1075,12 +1047,12 @@
           <wp:inline distB="114300" distT="114300" distL="114300" distR="114300">
             <wp:extent cx="5943600" cy="1739900"/>
             <wp:effectExtent b="0" l="0" r="0" t="0"/>
-            <wp:docPr id="9" name="image6.png"/>
+            <wp:docPr id="4" name="image3.png"/>
             <a:graphic>
               <a:graphicData uri="http://schemas.openxmlformats.org/drawingml/2006/picture">
                 <pic:pic>
                   <pic:nvPicPr>
-                    <pic:cNvPr id="0" name="image6.png"/>
+                    <pic:cNvPr id="0" name="image3.png"/>
                     <pic:cNvPicPr preferRelativeResize="0"/>
                   </pic:nvPicPr>
                   <pic:blipFill>
@@ -1120,20 +1092,6 @@
       </w:pPr>
       <w:r>
         <w:rPr>
-          <w:rtl w:val="0"/>
-        </w:rPr>
-      </w:r>
-    </w:p>
-    <w:p>
-      <w:pPr>
-        <w:rPr>
-          <w:rFonts w:ascii="Times New Roman" w:cs="Times New Roman" w:eastAsia="Times New Roman" w:hAnsi="Times New Roman"/>
-          <w:sz w:val="24"/>
-          <w:szCs w:val="24"/>
-        </w:rPr>
-      </w:pPr>
-      <w:r>
-        <w:rPr>
           <w:rFonts w:ascii="Times New Roman" w:cs="Times New Roman" w:eastAsia="Times New Roman" w:hAnsi="Times New Roman"/>
           <w:sz w:val="24"/>
           <w:szCs w:val="24"/>
@@ -1177,7 +1135,7 @@
           <w:szCs w:val="24"/>
           <w:rtl w:val="0"/>
         </w:rPr>
-        <w:t xml:space="preserve">Click on containers and then on the Port 8080:8080. </w:t>
+        <w:t xml:space="preserve">Click on containers and then on the Port 8135:8080. </w:t>
       </w:r>
     </w:p>
     <w:p>
@@ -1242,19 +1200,19 @@
         </w:rPr>
         <w:drawing>
           <wp:inline distB="114300" distT="114300" distL="114300" distR="114300">
-            <wp:extent cx="5943600" cy="2590800"/>
+            <wp:extent cx="5943600" cy="3086584"/>
             <wp:effectExtent b="0" l="0" r="0" t="0"/>
-            <wp:docPr id="12" name="image5.png"/>
+            <wp:docPr id="6" name="image2.png"/>
             <a:graphic>
               <a:graphicData uri="http://schemas.openxmlformats.org/drawingml/2006/picture">
                 <pic:pic>
                   <pic:nvPicPr>
-                    <pic:cNvPr id="0" name="image5.png"/>
+                    <pic:cNvPr id="0" name="image2.png"/>
                     <pic:cNvPicPr preferRelativeResize="0"/>
                   </pic:nvPicPr>
                   <pic:blipFill>
                     <a:blip r:embed="rId15"/>
-                    <a:srcRect b="0" l="0" r="0" t="0"/>
+                    <a:srcRect b="44983" l="0" r="0" t="0"/>
                     <a:stretch>
                       <a:fillRect/>
                     </a:stretch>
@@ -1262,7 +1220,7 @@
                   <pic:spPr>
                     <a:xfrm>
                       <a:off x="0" y="0"/>
-                      <a:ext cx="5943600" cy="2590800"/>
+                      <a:ext cx="5943600" cy="3086584"/>
                     </a:xfrm>
                     <a:prstGeom prst="rect"/>
                     <a:ln/>
@@ -1507,14 +1465,14 @@
         </w:rPr>
         <w:drawing>
           <wp:inline distB="114300" distT="114300" distL="114300" distR="114300">
-            <wp:extent cx="5943600" cy="3695700"/>
+            <wp:extent cx="5943600" cy="3746500"/>
             <wp:effectExtent b="0" l="0" r="0" t="0"/>
-            <wp:docPr id="11" name="image3.png"/>
+            <wp:docPr id="2" name="image5.png"/>
             <a:graphic>
               <a:graphicData uri="http://schemas.openxmlformats.org/drawingml/2006/picture">
                 <pic:pic>
                   <pic:nvPicPr>
-                    <pic:cNvPr id="0" name="image3.png"/>
+                    <pic:cNvPr id="0" name="image5.png"/>
                     <pic:cNvPicPr preferRelativeResize="0"/>
                   </pic:nvPicPr>
                   <pic:blipFill>
@@ -1527,7 +1485,7 @@
                   <pic:spPr>
                     <a:xfrm>
                       <a:off x="0" y="0"/>
-                      <a:ext cx="5943600" cy="3695700"/>
+                      <a:ext cx="5943600" cy="3746500"/>
                     </a:xfrm>
                     <a:prstGeom prst="rect"/>
                     <a:ln/>
@@ -1564,14 +1522,32 @@
           <w:rFonts w:ascii="Times New Roman" w:cs="Times New Roman" w:eastAsia="Times New Roman" w:hAnsi="Times New Roman"/>
           <w:sz w:val="24"/>
           <w:szCs w:val="24"/>
-        </w:rPr>
-      </w:pPr>
-      <w:r>
-        <w:rPr>
-          <w:rFonts w:ascii="Times New Roman" w:cs="Times New Roman" w:eastAsia="Times New Roman" w:hAnsi="Times New Roman"/>
-          <w:sz w:val="24"/>
-          <w:szCs w:val="24"/>
           <w:u w:val="single"/>
+        </w:rPr>
+      </w:pPr>
+      <w:r>
+        <w:br w:type="page"/>
+      </w:r>
+      <w:r>
+        <w:rPr>
+          <w:rtl w:val="0"/>
+        </w:rPr>
+      </w:r>
+    </w:p>
+    <w:p>
+      <w:pPr>
+        <w:rPr>
+          <w:rFonts w:ascii="Times New Roman" w:cs="Times New Roman" w:eastAsia="Times New Roman" w:hAnsi="Times New Roman"/>
+          <w:sz w:val="24"/>
+          <w:szCs w:val="24"/>
+        </w:rPr>
+      </w:pPr>
+      <w:r>
+        <w:rPr>
+          <w:rFonts w:ascii="Times New Roman" w:cs="Times New Roman" w:eastAsia="Times New Roman" w:hAnsi="Times New Roman"/>
+          <w:sz w:val="24"/>
+          <w:szCs w:val="24"/>
+          <w:u w:val="single"/>
           <w:rtl w:val="0"/>
         </w:rPr>
         <w:t xml:space="preserve">Step 6: Closing</w:t>
@@ -1643,7 +1619,7 @@
           <w:szCs w:val="24"/>
           <w:rtl w:val="0"/>
         </w:rPr>
-        <w:t xml:space="preserve">Check your files and they should be saved.</w:t>
+        <w:t xml:space="preserve">Check your files and they should be saved. Remember to explicitly download them from the webapp ide for submission to codegrade. They do not autosave.</w:t>
       </w:r>
     </w:p>
     <w:p>
@@ -1676,14 +1652,14 @@
         </w:rPr>
         <w:drawing>
           <wp:inline distB="114300" distT="114300" distL="114300" distR="114300">
-            <wp:extent cx="5943600" cy="520700"/>
+            <wp:extent cx="5943600" cy="2616200"/>
             <wp:effectExtent b="0" l="0" r="0" t="0"/>
-            <wp:docPr id="7" name="image1.png"/>
+            <wp:docPr id="1" name="image6.png"/>
             <a:graphic>
               <a:graphicData uri="http://schemas.openxmlformats.org/drawingml/2006/picture">
                 <pic:pic>
                   <pic:nvPicPr>
-                    <pic:cNvPr id="0" name="image1.png"/>
+                    <pic:cNvPr id="0" name="image6.png"/>
                     <pic:cNvPicPr preferRelativeResize="0"/>
                   </pic:nvPicPr>
                   <pic:blipFill>
@@ -1696,7 +1672,7 @@
                   <pic:spPr>
                     <a:xfrm>
                       <a:off x="0" y="0"/>
-                      <a:ext cx="5943600" cy="520700"/>
+                      <a:ext cx="5943600" cy="2616200"/>
                     </a:xfrm>
                     <a:prstGeom prst="rect"/>
                     <a:ln/>
@@ -1871,20 +1847,6 @@
       <w:sz w:val="52"/>
       <w:szCs w:val="52"/>
     </w:rPr>
-  </w:style>
-  <w:style w:type="table" w:styleId="TableNormal" w:default="1">
-    <w:name w:val="TableNormal"/>
-    <w:tblPr>
-      <w:tblCellMar>
-        <w:top w:w="100.0" w:type="dxa"/>
-        <w:left w:w="100.0" w:type="dxa"/>
-        <w:bottom w:w="100.0" w:type="dxa"/>
-        <w:right w:w="100.0" w:type="dxa"/>
-      </w:tblCellMar>
-    </w:tblPr>
-  </w:style>
-  <w:style w:type="paragraph" w:styleId="Normal" w:default="1">
-    <w:name w:val="normal"/>
   </w:style>
   <w:style w:type="paragraph" w:styleId="Subtitle">
     <w:name w:val="Subtitle"/>
@@ -2230,7 +2192,7 @@
 
 <file path=customXML/item1.xml><?xml version="1.0" encoding="utf-8"?>
 <go:gDocsCustomXmlDataStorage xmlns:go="http://customooxmlschemas.google.com/" xmlns:r="http://schemas.openxmlformats.org/officeDocument/2006/relationships" uri="GoogleDocsCustomDataVersion2">
-  <go:docsCustomData xmlns:go="http://customooxmlschemas.google.com/" roundtripDataSignature="AMtx7mhQ0ZM2m3ZMeBffhxa0MzWZvDurnw==">CgMxLjA4AHIhMTdMNm14SGU5dTd2NTFLbzdCcHhma0dLbXNaZ3lGcTN2</go:docsCustomData>
+  <go:docsCustomData xmlns:go="http://customooxmlschemas.google.com/" roundtripDataSignature="AMtx7miMFBeuMWDndBQuK454d4vjk97VIg==">CgMxLjA4AHIhMUE2ZV85cnRPcmtUMVNwV2NMTXNOTlJxRzRBV011S3pT</go:docsCustomData>
 </go:gDocsCustomXmlDataStorage>
 </file>
 

</xml_diff>

<commit_message>
Finalize student handouts: Design Documents and Update Instructions
Per-course commands (course-number ports, bind mounts, --platform for
x86), corrected file-persistence/autosave wording, retaken screenshots
(clean browser profile, no trust banner, new favicons).

Co-Authored-By: Claude Fable 5 <noreply@anthropic.com>
</commit_message>
<xml_diff>
--- a/cpp/Design Document.docx
+++ b/cpp/Design Document.docx
@@ -720,12 +720,12 @@
           <wp:inline distB="114300" distT="114300" distL="114300" distR="114300">
             <wp:extent cx="5386388" cy="4224425"/>
             <wp:effectExtent b="0" l="0" r="0" t="0"/>
-            <wp:docPr id="3" name="image1.png"/>
+            <wp:docPr id="3" name="image4.png"/>
             <a:graphic>
               <a:graphicData uri="http://schemas.openxmlformats.org/drawingml/2006/picture">
                 <pic:pic>
                   <pic:nvPicPr>
-                    <pic:cNvPr id="0" name="image1.png"/>
+                    <pic:cNvPr id="0" name="image4.png"/>
                     <pic:cNvPicPr preferRelativeResize="0"/>
                   </pic:nvPicPr>
                   <pic:blipFill>
@@ -905,12 +905,12 @@
           <wp:inline distB="114300" distT="114300" distL="114300" distR="114300">
             <wp:extent cx="5595938" cy="3989696"/>
             <wp:effectExtent b="0" l="0" r="0" t="0"/>
-            <wp:docPr id="5" name="image4.png"/>
+            <wp:docPr id="5" name="image1.png"/>
             <a:graphic>
               <a:graphicData uri="http://schemas.openxmlformats.org/drawingml/2006/picture">
                 <pic:pic>
                   <pic:nvPicPr>
-                    <pic:cNvPr id="0" name="image4.png"/>
+                    <pic:cNvPr id="0" name="image1.png"/>
                     <pic:cNvPicPr preferRelativeResize="0"/>
                   </pic:nvPicPr>
                   <pic:blipFill>
@@ -1202,12 +1202,12 @@
           <wp:inline distB="114300" distT="114300" distL="114300" distR="114300">
             <wp:extent cx="5943600" cy="3086584"/>
             <wp:effectExtent b="0" l="0" r="0" t="0"/>
-            <wp:docPr id="6" name="image2.png"/>
+            <wp:docPr id="6" name="image5.png"/>
             <a:graphic>
               <a:graphicData uri="http://schemas.openxmlformats.org/drawingml/2006/picture">
                 <pic:pic>
                   <pic:nvPicPr>
-                    <pic:cNvPr id="0" name="image2.png"/>
+                    <pic:cNvPr id="0" name="image5.png"/>
                     <pic:cNvPicPr preferRelativeResize="0"/>
                   </pic:nvPicPr>
                   <pic:blipFill>
@@ -1400,7 +1400,7 @@
           <w:szCs w:val="24"/>
           <w:rtl w:val="0"/>
         </w:rPr>
-        <w:t xml:space="preserve">Save the files into your computer for submission to CodeGrade as it does not get saved on your local files only in itself.</w:t>
+        <w:t xml:space="preserve">Save the files into your computer for easier submission to CodeGrade. There is file persistence and they get saved to an autogenerated workspace folder in your machine. You can find it explicitly and that file autosaves or you can also download fresh.</w:t>
       </w:r>
     </w:p>
     <w:p>
@@ -1465,14 +1465,14 @@
         </w:rPr>
         <w:drawing>
           <wp:inline distB="114300" distT="114300" distL="114300" distR="114300">
-            <wp:extent cx="5943600" cy="3746500"/>
+            <wp:extent cx="5943600" cy="3721100"/>
             <wp:effectExtent b="0" l="0" r="0" t="0"/>
-            <wp:docPr id="2" name="image5.png"/>
+            <wp:docPr id="1" name="image6.png"/>
             <a:graphic>
               <a:graphicData uri="http://schemas.openxmlformats.org/drawingml/2006/picture">
                 <pic:pic>
                   <pic:nvPicPr>
-                    <pic:cNvPr id="0" name="image5.png"/>
+                    <pic:cNvPr id="0" name="image6.png"/>
                     <pic:cNvPicPr preferRelativeResize="0"/>
                   </pic:nvPicPr>
                   <pic:blipFill>
@@ -1485,7 +1485,7 @@
                   <pic:spPr>
                     <a:xfrm>
                       <a:off x="0" y="0"/>
-                      <a:ext cx="5943600" cy="3746500"/>
+                      <a:ext cx="5943600" cy="3721100"/>
                     </a:xfrm>
                     <a:prstGeom prst="rect"/>
                     <a:ln/>
@@ -1619,7 +1619,7 @@
           <w:szCs w:val="24"/>
           <w:rtl w:val="0"/>
         </w:rPr>
-        <w:t xml:space="preserve">Check your files and they should be saved. Remember to explicitly download them from the webapp ide for submission to codegrade. They do not autosave.</w:t>
+        <w:t xml:space="preserve">Check your files and they should be saved. They are located in an autocreated workspace folder. For easier submission instead of finding the files, remember to explicitly download them from the webapp ide for submission to codegrade. Downloaded files do not autosave so save before submitting to CodeGrade.</w:t>
       </w:r>
     </w:p>
     <w:p>
@@ -1654,12 +1654,12 @@
           <wp:inline distB="114300" distT="114300" distL="114300" distR="114300">
             <wp:extent cx="5943600" cy="2616200"/>
             <wp:effectExtent b="0" l="0" r="0" t="0"/>
-            <wp:docPr id="1" name="image6.png"/>
+            <wp:docPr id="2" name="image2.png"/>
             <a:graphic>
               <a:graphicData uri="http://schemas.openxmlformats.org/drawingml/2006/picture">
                 <pic:pic>
                   <pic:nvPicPr>
-                    <pic:cNvPr id="0" name="image6.png"/>
+                    <pic:cNvPr id="0" name="image2.png"/>
                     <pic:cNvPicPr preferRelativeResize="0"/>
                   </pic:nvPicPr>
                   <pic:blipFill>

</xml_diff>

<commit_message>
Design Documents: fix swapped Step 5 IDE screenshots
cpp doc now shows the C++ IDE (8135), x86 doc the assembly IDE (8218).

Co-Authored-By: Claude Fable 5 <noreply@anthropic.com>
</commit_message>
<xml_diff>
--- a/cpp/Design Document.docx
+++ b/cpp/Design Document.docx
@@ -720,12 +720,12 @@
           <wp:inline distB="114300" distT="114300" distL="114300" distR="114300">
             <wp:extent cx="5386388" cy="4224425"/>
             <wp:effectExtent b="0" l="0" r="0" t="0"/>
-            <wp:docPr id="3" name="image4.png"/>
+            <wp:docPr id="2" name="image5.png"/>
             <a:graphic>
               <a:graphicData uri="http://schemas.openxmlformats.org/drawingml/2006/picture">
                 <pic:pic>
                   <pic:nvPicPr>
-                    <pic:cNvPr id="0" name="image4.png"/>
+                    <pic:cNvPr id="0" name="image5.png"/>
                     <pic:cNvPicPr preferRelativeResize="0"/>
                   </pic:nvPicPr>
                   <pic:blipFill>
@@ -905,7 +905,7 @@
           <wp:inline distB="114300" distT="114300" distL="114300" distR="114300">
             <wp:extent cx="5595938" cy="3989696"/>
             <wp:effectExtent b="0" l="0" r="0" t="0"/>
-            <wp:docPr id="5" name="image1.png"/>
+            <wp:docPr id="4" name="image1.png"/>
             <a:graphic>
               <a:graphicData uri="http://schemas.openxmlformats.org/drawingml/2006/picture">
                 <pic:pic>
@@ -1047,12 +1047,12 @@
           <wp:inline distB="114300" distT="114300" distL="114300" distR="114300">
             <wp:extent cx="5943600" cy="1739900"/>
             <wp:effectExtent b="0" l="0" r="0" t="0"/>
-            <wp:docPr id="4" name="image3.png"/>
+            <wp:docPr id="3" name="image2.png"/>
             <a:graphic>
               <a:graphicData uri="http://schemas.openxmlformats.org/drawingml/2006/picture">
                 <pic:pic>
                   <pic:nvPicPr>
-                    <pic:cNvPr id="0" name="image3.png"/>
+                    <pic:cNvPr id="0" name="image2.png"/>
                     <pic:cNvPicPr preferRelativeResize="0"/>
                   </pic:nvPicPr>
                   <pic:blipFill>
@@ -1202,12 +1202,12 @@
           <wp:inline distB="114300" distT="114300" distL="114300" distR="114300">
             <wp:extent cx="5943600" cy="3086584"/>
             <wp:effectExtent b="0" l="0" r="0" t="0"/>
-            <wp:docPr id="6" name="image5.png"/>
+            <wp:docPr id="6" name="image4.png"/>
             <a:graphic>
               <a:graphicData uri="http://schemas.openxmlformats.org/drawingml/2006/picture">
                 <pic:pic>
                   <pic:nvPicPr>
-                    <pic:cNvPr id="0" name="image5.png"/>
+                    <pic:cNvPr id="0" name="image4.png"/>
                     <pic:cNvPicPr preferRelativeResize="0"/>
                   </pic:nvPicPr>
                   <pic:blipFill>
@@ -1465,19 +1465,19 @@
         </w:rPr>
         <w:drawing>
           <wp:inline distB="114300" distT="114300" distL="114300" distR="114300">
-            <wp:extent cx="5943600" cy="3721100"/>
+            <wp:extent cx="5943600" cy="3475658"/>
             <wp:effectExtent b="0" l="0" r="0" t="0"/>
-            <wp:docPr id="1" name="image6.png"/>
+            <wp:docPr id="5" name="image3.png"/>
             <a:graphic>
               <a:graphicData uri="http://schemas.openxmlformats.org/drawingml/2006/picture">
                 <pic:pic>
                   <pic:nvPicPr>
-                    <pic:cNvPr id="0" name="image6.png"/>
+                    <pic:cNvPr id="0" name="image3.png"/>
                     <pic:cNvPicPr preferRelativeResize="0"/>
                   </pic:nvPicPr>
                   <pic:blipFill>
                     <a:blip r:embed="rId16"/>
-                    <a:srcRect b="0" l="0" r="0" t="0"/>
+                    <a:srcRect b="0" l="0" r="0" t="6703"/>
                     <a:stretch>
                       <a:fillRect/>
                     </a:stretch>
@@ -1485,7 +1485,7 @@
                   <pic:spPr>
                     <a:xfrm>
                       <a:off x="0" y="0"/>
-                      <a:ext cx="5943600" cy="3721100"/>
+                      <a:ext cx="5943600" cy="3475658"/>
                     </a:xfrm>
                     <a:prstGeom prst="rect"/>
                     <a:ln/>
@@ -1654,12 +1654,12 @@
           <wp:inline distB="114300" distT="114300" distL="114300" distR="114300">
             <wp:extent cx="5943600" cy="2616200"/>
             <wp:effectExtent b="0" l="0" r="0" t="0"/>
-            <wp:docPr id="2" name="image2.png"/>
+            <wp:docPr id="1" name="image6.png"/>
             <a:graphic>
               <a:graphicData uri="http://schemas.openxmlformats.org/drawingml/2006/picture">
                 <pic:pic>
                   <pic:nvPicPr>
-                    <pic:cNvPr id="0" name="image2.png"/>
+                    <pic:cNvPr id="0" name="image6.png"/>
                     <pic:cNvPicPr preferRelativeResize="0"/>
                   </pic:nvPicPr>
                   <pic:blipFill>
@@ -2192,7 +2192,7 @@
 
 <file path=customXML/item1.xml><?xml version="1.0" encoding="utf-8"?>
 <go:gDocsCustomXmlDataStorage xmlns:go="http://customooxmlschemas.google.com/" xmlns:r="http://schemas.openxmlformats.org/officeDocument/2006/relationships" uri="GoogleDocsCustomDataVersion2">
-  <go:docsCustomData xmlns:go="http://customooxmlschemas.google.com/" roundtripDataSignature="AMtx7miMFBeuMWDndBQuK454d4vjk97VIg==">CgMxLjA4AHIhMUE2ZV85cnRPcmtUMVNwV2NMTXNOTlJxRzRBV011S3pT</go:docsCustomData>
+  <go:docsCustomData xmlns:go="http://customooxmlschemas.google.com/" roundtripDataSignature="AMtx7mjlLsaJIS51gJcsu3NdmD6Kl0qGJw==">CgMxLjA4AHIhMVUtZVYtWGxTVTBHSHhwZUlIM3RqQnozb19hYk1Nc2Fk</go:docsCustomData>
 </go:gDocsCustomXmlDataStorage>
 </file>
 

</xml_diff>

<commit_message>
Design Documents: bake cropped Step 5 screenshots
IDE screenshots cropped before insertion (no browser chrome, no
recoverable originals in the docx media). Closes the stale-tab-title
issue permanently.

Co-Authored-By: Claude Fable 5 <noreply@anthropic.com>
</commit_message>
<xml_diff>
--- a/cpp/Design Document.docx
+++ b/cpp/Design Document.docx
@@ -720,12 +720,12 @@
           <wp:inline distB="114300" distT="114300" distL="114300" distR="114300">
             <wp:extent cx="5386388" cy="4224425"/>
             <wp:effectExtent b="0" l="0" r="0" t="0"/>
-            <wp:docPr id="2" name="image5.png"/>
+            <wp:docPr id="4" name="image4.png"/>
             <a:graphic>
               <a:graphicData uri="http://schemas.openxmlformats.org/drawingml/2006/picture">
                 <pic:pic>
                   <pic:nvPicPr>
-                    <pic:cNvPr id="0" name="image5.png"/>
+                    <pic:cNvPr id="0" name="image4.png"/>
                     <pic:cNvPicPr preferRelativeResize="0"/>
                   </pic:nvPicPr>
                   <pic:blipFill>
@@ -905,7 +905,7 @@
           <wp:inline distB="114300" distT="114300" distL="114300" distR="114300">
             <wp:extent cx="5595938" cy="3989696"/>
             <wp:effectExtent b="0" l="0" r="0" t="0"/>
-            <wp:docPr id="4" name="image1.png"/>
+            <wp:docPr id="6" name="image1.png"/>
             <a:graphic>
               <a:graphicData uri="http://schemas.openxmlformats.org/drawingml/2006/picture">
                 <pic:pic>
@@ -1047,7 +1047,7 @@
           <wp:inline distB="114300" distT="114300" distL="114300" distR="114300">
             <wp:extent cx="5943600" cy="1739900"/>
             <wp:effectExtent b="0" l="0" r="0" t="0"/>
-            <wp:docPr id="3" name="image2.png"/>
+            <wp:docPr id="5" name="image2.png"/>
             <a:graphic>
               <a:graphicData uri="http://schemas.openxmlformats.org/drawingml/2006/picture">
                 <pic:pic>
@@ -1194,25 +1194,53 @@
       </w:pPr>
       <w:r>
         <w:rPr>
+          <w:rtl w:val="0"/>
+        </w:rPr>
+      </w:r>
+    </w:p>
+    <w:p>
+      <w:pPr>
+        <w:rPr>
+          <w:rFonts w:ascii="Times New Roman" w:cs="Times New Roman" w:eastAsia="Times New Roman" w:hAnsi="Times New Roman"/>
+          <w:sz w:val="24"/>
+          <w:szCs w:val="24"/>
+        </w:rPr>
+      </w:pPr>
+      <w:r>
+        <w:rPr>
+          <w:rtl w:val="0"/>
+        </w:rPr>
+      </w:r>
+    </w:p>
+    <w:p>
+      <w:pPr>
+        <w:rPr>
+          <w:rFonts w:ascii="Times New Roman" w:cs="Times New Roman" w:eastAsia="Times New Roman" w:hAnsi="Times New Roman"/>
+          <w:sz w:val="24"/>
+          <w:szCs w:val="24"/>
+        </w:rPr>
+      </w:pPr>
+      <w:r>
+        <w:rPr>
           <w:rFonts w:ascii="Times New Roman" w:cs="Times New Roman" w:eastAsia="Times New Roman" w:hAnsi="Times New Roman"/>
           <w:sz w:val="24"/>
           <w:szCs w:val="24"/>
         </w:rPr>
         <w:drawing>
           <wp:inline distB="114300" distT="114300" distL="114300" distR="114300">
-            <wp:extent cx="5943600" cy="3086584"/>
+            <wp:extent cx="5943600" cy="3098800"/>
             <wp:effectExtent b="0" l="0" r="0" t="0"/>
-            <wp:docPr id="6" name="image4.png"/>
+            <wp:docPr id="3" name="image5.png"/>
             <a:graphic>
               <a:graphicData uri="http://schemas.openxmlformats.org/drawingml/2006/picture">
                 <pic:pic>
                   <pic:nvPicPr>
-                    <pic:cNvPr id="0" name="image4.png"/>
+                    <pic:cNvPr id="0" name="image5.png"/>
                     <pic:cNvPicPr preferRelativeResize="0"/>
                   </pic:nvPicPr>
                   <pic:blipFill>
                     <a:blip r:embed="rId15"/>
-                    <a:srcRect b="44983" l="0" r="0" t="0"/>
+                    <a:srcRect b="0" l="0" r="0" t="0"/>
                     <a:stretch>
                       <a:fillRect/>
                     </a:stretch>
@@ -1220,7 +1248,7 @@
                   <pic:spPr>
                     <a:xfrm>
                       <a:off x="0" y="0"/>
-                      <a:ext cx="5943600" cy="3086584"/>
+                      <a:ext cx="5943600" cy="3098800"/>
                     </a:xfrm>
                     <a:prstGeom prst="rect"/>
                     <a:ln/>
@@ -1243,34 +1271,6 @@
           <w:rFonts w:ascii="Times New Roman" w:cs="Times New Roman" w:eastAsia="Times New Roman" w:hAnsi="Times New Roman"/>
           <w:sz w:val="24"/>
           <w:szCs w:val="24"/>
-        </w:rPr>
-      </w:pPr>
-      <w:r>
-        <w:rPr>
-          <w:rtl w:val="0"/>
-        </w:rPr>
-      </w:r>
-    </w:p>
-    <w:p>
-      <w:pPr>
-        <w:rPr>
-          <w:rFonts w:ascii="Times New Roman" w:cs="Times New Roman" w:eastAsia="Times New Roman" w:hAnsi="Times New Roman"/>
-          <w:sz w:val="24"/>
-          <w:szCs w:val="24"/>
-        </w:rPr>
-      </w:pPr>
-      <w:r>
-        <w:rPr>
-          <w:rtl w:val="0"/>
-        </w:rPr>
-      </w:r>
-    </w:p>
-    <w:p>
-      <w:pPr>
-        <w:rPr>
-          <w:rFonts w:ascii="Times New Roman" w:cs="Times New Roman" w:eastAsia="Times New Roman" w:hAnsi="Times New Roman"/>
-          <w:sz w:val="24"/>
-          <w:szCs w:val="24"/>
           <w:u w:val="single"/>
         </w:rPr>
       </w:pPr>
@@ -1455,6 +1455,35 @@
           <w:rFonts w:ascii="Times New Roman" w:cs="Times New Roman" w:eastAsia="Times New Roman" w:hAnsi="Times New Roman"/>
           <w:sz w:val="24"/>
           <w:szCs w:val="24"/>
+        </w:rPr>
+      </w:pPr>
+      <w:r>
+        <w:rPr>
+          <w:rtl w:val="0"/>
+        </w:rPr>
+      </w:r>
+    </w:p>
+    <w:p>
+      <w:pPr>
+        <w:rPr>
+          <w:rFonts w:ascii="Times New Roman" w:cs="Times New Roman" w:eastAsia="Times New Roman" w:hAnsi="Times New Roman"/>
+          <w:sz w:val="24"/>
+          <w:szCs w:val="24"/>
+        </w:rPr>
+      </w:pPr>
+      <w:r>
+        <w:rPr>
+          <w:rtl w:val="0"/>
+        </w:rPr>
+      </w:r>
+    </w:p>
+    <w:p>
+      <w:pPr>
+        <w:rPr>
+          <w:rFonts w:ascii="Times New Roman" w:cs="Times New Roman" w:eastAsia="Times New Roman" w:hAnsi="Times New Roman"/>
+          <w:sz w:val="24"/>
+          <w:szCs w:val="24"/>
+          <w:u w:val="single"/>
         </w:rPr>
       </w:pPr>
       <w:r>
@@ -1465,19 +1494,19 @@
         </w:rPr>
         <w:drawing>
           <wp:inline distB="114300" distT="114300" distL="114300" distR="114300">
-            <wp:extent cx="5943600" cy="3475658"/>
+            <wp:extent cx="5943600" cy="3517900"/>
             <wp:effectExtent b="0" l="0" r="0" t="0"/>
-            <wp:docPr id="5" name="image3.png"/>
+            <wp:docPr id="2" name="image6.png"/>
             <a:graphic>
               <a:graphicData uri="http://schemas.openxmlformats.org/drawingml/2006/picture">
                 <pic:pic>
                   <pic:nvPicPr>
-                    <pic:cNvPr id="0" name="image3.png"/>
+                    <pic:cNvPr id="0" name="image6.png"/>
                     <pic:cNvPicPr preferRelativeResize="0"/>
                   </pic:nvPicPr>
                   <pic:blipFill>
                     <a:blip r:embed="rId16"/>
-                    <a:srcRect b="0" l="0" r="0" t="6703"/>
+                    <a:srcRect b="0" l="0" r="0" t="0"/>
                     <a:stretch>
                       <a:fillRect/>
                     </a:stretch>
@@ -1485,7 +1514,7 @@
                   <pic:spPr>
                     <a:xfrm>
                       <a:off x="0" y="0"/>
-                      <a:ext cx="5943600" cy="3475658"/>
+                      <a:ext cx="5943600" cy="3517900"/>
                     </a:xfrm>
                     <a:prstGeom prst="rect"/>
                     <a:ln/>
@@ -1508,20 +1537,6 @@
           <w:rFonts w:ascii="Times New Roman" w:cs="Times New Roman" w:eastAsia="Times New Roman" w:hAnsi="Times New Roman"/>
           <w:sz w:val="24"/>
           <w:szCs w:val="24"/>
-        </w:rPr>
-      </w:pPr>
-      <w:r>
-        <w:rPr>
-          <w:rtl w:val="0"/>
-        </w:rPr>
-      </w:r>
-    </w:p>
-    <w:p>
-      <w:pPr>
-        <w:rPr>
-          <w:rFonts w:ascii="Times New Roman" w:cs="Times New Roman" w:eastAsia="Times New Roman" w:hAnsi="Times New Roman"/>
-          <w:sz w:val="24"/>
-          <w:szCs w:val="24"/>
           <w:u w:val="single"/>
         </w:rPr>
       </w:pPr>
@@ -1654,12 +1669,12 @@
           <wp:inline distB="114300" distT="114300" distL="114300" distR="114300">
             <wp:extent cx="5943600" cy="2616200"/>
             <wp:effectExtent b="0" l="0" r="0" t="0"/>
-            <wp:docPr id="1" name="image6.png"/>
+            <wp:docPr id="1" name="image3.png"/>
             <a:graphic>
               <a:graphicData uri="http://schemas.openxmlformats.org/drawingml/2006/picture">
                 <pic:pic>
                   <pic:nvPicPr>
-                    <pic:cNvPr id="0" name="image6.png"/>
+                    <pic:cNvPr id="0" name="image3.png"/>
                     <pic:cNvPicPr preferRelativeResize="0"/>
                   </pic:nvPicPr>
                   <pic:blipFill>

</xml_diff>

<commit_message>
Handouts: optional resource-cap command for weaker machines, Step 1 typo fix
Both Design Documents' Step 3 now offers an alternate run command with
--memory=2g --cpus=2 (and the delete-container-then-rerun note for
switching). x86 Update Instructions: 'and the delete' -> 'and then delete'.

Co-Authored-By: Claude Fable 5 <noreply@anthropic.com>
</commit_message>
<xml_diff>
--- a/cpp/Design Document.docx
+++ b/cpp/Design Document.docx
@@ -720,12 +720,12 @@
           <wp:inline distB="114300" distT="114300" distL="114300" distR="114300">
             <wp:extent cx="5386388" cy="4224425"/>
             <wp:effectExtent b="0" l="0" r="0" t="0"/>
-            <wp:docPr id="4" name="image4.png"/>
+            <wp:docPr id="2" name="image3.png"/>
             <a:graphic>
               <a:graphicData uri="http://schemas.openxmlformats.org/drawingml/2006/picture">
                 <pic:pic>
                   <pic:nvPicPr>
-                    <pic:cNvPr id="0" name="image4.png"/>
+                    <pic:cNvPr id="0" name="image3.png"/>
                     <pic:cNvPicPr preferRelativeResize="0"/>
                   </pic:nvPicPr>
                   <pic:blipFill>
@@ -905,7 +905,7 @@
           <wp:inline distB="114300" distT="114300" distL="114300" distR="114300">
             <wp:extent cx="5595938" cy="3989696"/>
             <wp:effectExtent b="0" l="0" r="0" t="0"/>
-            <wp:docPr id="6" name="image1.png"/>
+            <wp:docPr id="4" name="image1.png"/>
             <a:graphic>
               <a:graphicData uri="http://schemas.openxmlformats.org/drawingml/2006/picture">
                 <pic:pic>
@@ -960,6 +960,24 @@
           <w:rFonts w:ascii="Times New Roman" w:cs="Times New Roman" w:eastAsia="Times New Roman" w:hAnsi="Times New Roman"/>
           <w:sz w:val="24"/>
           <w:szCs w:val="24"/>
+          <w:u w:val="single"/>
+        </w:rPr>
+      </w:pPr>
+      <w:r>
+        <w:br w:type="page"/>
+      </w:r>
+      <w:r>
+        <w:rPr>
+          <w:rtl w:val="0"/>
+        </w:rPr>
+      </w:r>
+    </w:p>
+    <w:p>
+      <w:pPr>
+        <w:rPr>
+          <w:rFonts w:ascii="Times New Roman" w:cs="Times New Roman" w:eastAsia="Times New Roman" w:hAnsi="Times New Roman"/>
+          <w:sz w:val="24"/>
+          <w:szCs w:val="24"/>
         </w:rPr>
       </w:pPr>
       <w:r>
@@ -1027,6 +1045,88 @@
         </w:rPr>
         <w:br w:type="textWrapping"/>
         <w:t xml:space="preserve">docker run -it --name unlv-cpp-ide -p 127.0.0.1:8135:8080 -v "$HOME/UNLV/cpp-workspace:/home/coder/workspace" seancnc/unlv-cpp-ide</w:t>
+      </w:r>
+    </w:p>
+    <w:p>
+      <w:pPr>
+        <w:rPr>
+          <w:rFonts w:ascii="Times New Roman" w:cs="Times New Roman" w:eastAsia="Times New Roman" w:hAnsi="Times New Roman"/>
+          <w:sz w:val="24"/>
+          <w:szCs w:val="24"/>
+        </w:rPr>
+      </w:pPr>
+      <w:r>
+        <w:rPr>
+          <w:rtl w:val="0"/>
+        </w:rPr>
+      </w:r>
+    </w:p>
+    <w:p>
+      <w:pPr>
+        <w:rPr>
+          <w:rFonts w:ascii="Times New Roman" w:cs="Times New Roman" w:eastAsia="Times New Roman" w:hAnsi="Times New Roman"/>
+          <w:sz w:val="24"/>
+          <w:szCs w:val="24"/>
+        </w:rPr>
+      </w:pPr>
+      <w:r>
+        <w:rPr>
+          <w:rFonts w:ascii="Times New Roman" w:cs="Times New Roman" w:eastAsia="Times New Roman" w:hAnsi="Times New Roman"/>
+          <w:sz w:val="24"/>
+          <w:szCs w:val="24"/>
+          <w:rtl w:val="0"/>
+        </w:rPr>
+        <w:t xml:space="preserve">Optional tag for weaker machines to cap resources = configure memory and cpus</w:t>
+      </w:r>
+    </w:p>
+    <w:p>
+      <w:pPr>
+        <w:rPr>
+          <w:rFonts w:ascii="Times New Roman" w:cs="Times New Roman" w:eastAsia="Times New Roman" w:hAnsi="Times New Roman"/>
+          <w:sz w:val="24"/>
+          <w:szCs w:val="24"/>
+        </w:rPr>
+      </w:pPr>
+      <w:r>
+        <w:rPr>
+          <w:rFonts w:ascii="Times New Roman" w:cs="Times New Roman" w:eastAsia="Times New Roman" w:hAnsi="Times New Roman"/>
+          <w:sz w:val="24"/>
+          <w:szCs w:val="24"/>
+          <w:rtl w:val="0"/>
+        </w:rPr>
+        <w:t xml:space="preserve">(note if performance is bad, you must delete only the container and re-run the command above)</w:t>
+      </w:r>
+    </w:p>
+    <w:p>
+      <w:pPr>
+        <w:rPr>
+          <w:rFonts w:ascii="Times New Roman" w:cs="Times New Roman" w:eastAsia="Times New Roman" w:hAnsi="Times New Roman"/>
+          <w:sz w:val="24"/>
+          <w:szCs w:val="24"/>
+        </w:rPr>
+      </w:pPr>
+      <w:r>
+        <w:rPr>
+          <w:rtl w:val="0"/>
+        </w:rPr>
+      </w:r>
+    </w:p>
+    <w:p>
+      <w:pPr>
+        <w:rPr>
+          <w:rFonts w:ascii="Times New Roman" w:cs="Times New Roman" w:eastAsia="Times New Roman" w:hAnsi="Times New Roman"/>
+          <w:sz w:val="24"/>
+          <w:szCs w:val="24"/>
+        </w:rPr>
+      </w:pPr>
+      <w:r>
+        <w:rPr>
+          <w:rFonts w:ascii="Times New Roman" w:cs="Times New Roman" w:eastAsia="Times New Roman" w:hAnsi="Times New Roman"/>
+          <w:sz w:val="24"/>
+          <w:szCs w:val="24"/>
+          <w:rtl w:val="0"/>
+        </w:rPr>
+        <w:t xml:space="preserve">docker run -it --memory=2g --cpus=2 --name unlv-cpp-ide -p 127.0.0.1:8135:8080 -v "$HOME/UNLV/cpp-workspace:/home/coder/workspace" seancnc/unlv-cpp-ide</w:t>
       </w:r>
     </w:p>
     <w:p>
@@ -1047,12 +1147,12 @@
           <wp:inline distB="114300" distT="114300" distL="114300" distR="114300">
             <wp:extent cx="5943600" cy="1739900"/>
             <wp:effectExtent b="0" l="0" r="0" t="0"/>
-            <wp:docPr id="5" name="image2.png"/>
+            <wp:docPr id="3" name="image5.png"/>
             <a:graphic>
               <a:graphicData uri="http://schemas.openxmlformats.org/drawingml/2006/picture">
                 <pic:pic>
                   <pic:nvPicPr>
-                    <pic:cNvPr id="0" name="image2.png"/>
+                    <pic:cNvPr id="0" name="image5.png"/>
                     <pic:cNvPicPr preferRelativeResize="0"/>
                   </pic:nvPicPr>
                   <pic:blipFill>
@@ -1088,6 +1188,39 @@
           <w:rFonts w:ascii="Times New Roman" w:cs="Times New Roman" w:eastAsia="Times New Roman" w:hAnsi="Times New Roman"/>
           <w:sz w:val="24"/>
           <w:szCs w:val="24"/>
+          <w:u w:val="single"/>
+        </w:rPr>
+      </w:pPr>
+      <w:r>
+        <w:rPr>
+          <w:rtl w:val="0"/>
+        </w:rPr>
+      </w:r>
+    </w:p>
+    <w:p>
+      <w:pPr>
+        <w:rPr>
+          <w:rFonts w:ascii="Times New Roman" w:cs="Times New Roman" w:eastAsia="Times New Roman" w:hAnsi="Times New Roman"/>
+          <w:sz w:val="24"/>
+          <w:szCs w:val="24"/>
+          <w:u w:val="single"/>
+        </w:rPr>
+      </w:pPr>
+      <w:r>
+        <w:br w:type="page"/>
+      </w:r>
+      <w:r>
+        <w:rPr>
+          <w:rtl w:val="0"/>
+        </w:rPr>
+      </w:r>
+    </w:p>
+    <w:p>
+      <w:pPr>
+        <w:rPr>
+          <w:rFonts w:ascii="Times New Roman" w:cs="Times New Roman" w:eastAsia="Times New Roman" w:hAnsi="Times New Roman"/>
+          <w:sz w:val="24"/>
+          <w:szCs w:val="24"/>
         </w:rPr>
       </w:pPr>
       <w:r>
@@ -1230,12 +1363,12 @@
           <wp:inline distB="114300" distT="114300" distL="114300" distR="114300">
             <wp:extent cx="5943600" cy="3098800"/>
             <wp:effectExtent b="0" l="0" r="0" t="0"/>
-            <wp:docPr id="3" name="image5.png"/>
+            <wp:docPr id="6" name="image4.png"/>
             <a:graphic>
               <a:graphicData uri="http://schemas.openxmlformats.org/drawingml/2006/picture">
                 <pic:pic>
                   <pic:nvPicPr>
-                    <pic:cNvPr id="0" name="image5.png"/>
+                    <pic:cNvPr id="0" name="image4.png"/>
                     <pic:cNvPicPr preferRelativeResize="0"/>
                   </pic:nvPicPr>
                   <pic:blipFill>
@@ -1496,12 +1629,12 @@
           <wp:inline distB="114300" distT="114300" distL="114300" distR="114300">
             <wp:extent cx="5943600" cy="3517900"/>
             <wp:effectExtent b="0" l="0" r="0" t="0"/>
-            <wp:docPr id="2" name="image6.png"/>
+            <wp:docPr id="5" name="image2.png"/>
             <a:graphic>
               <a:graphicData uri="http://schemas.openxmlformats.org/drawingml/2006/picture">
                 <pic:pic>
                   <pic:nvPicPr>
-                    <pic:cNvPr id="0" name="image6.png"/>
+                    <pic:cNvPr id="0" name="image2.png"/>
                     <pic:cNvPicPr preferRelativeResize="0"/>
                   </pic:nvPicPr>
                   <pic:blipFill>
@@ -1669,12 +1802,12 @@
           <wp:inline distB="114300" distT="114300" distL="114300" distR="114300">
             <wp:extent cx="5943600" cy="2616200"/>
             <wp:effectExtent b="0" l="0" r="0" t="0"/>
-            <wp:docPr id="1" name="image3.png"/>
+            <wp:docPr id="1" name="image6.png"/>
             <a:graphic>
               <a:graphicData uri="http://schemas.openxmlformats.org/drawingml/2006/picture">
                 <pic:pic>
                   <pic:nvPicPr>
-                    <pic:cNvPr id="0" name="image3.png"/>
+                    <pic:cNvPr id="0" name="image6.png"/>
                     <pic:cNvPicPr preferRelativeResize="0"/>
                   </pic:nvPicPr>
                   <pic:blipFill>
@@ -2207,7 +2340,7 @@
 
 <file path=customXML/item1.xml><?xml version="1.0" encoding="utf-8"?>
 <go:gDocsCustomXmlDataStorage xmlns:go="http://customooxmlschemas.google.com/" xmlns:r="http://schemas.openxmlformats.org/officeDocument/2006/relationships" uri="GoogleDocsCustomDataVersion2">
-  <go:docsCustomData xmlns:go="http://customooxmlschemas.google.com/" roundtripDataSignature="AMtx7mjlLsaJIS51gJcsu3NdmD6Kl0qGJw==">CgMxLjA4AHIhMVUtZVYtWGxTVTBHSHhwZUlIM3RqQnozb19hYk1Nc2Fk</go:docsCustomData>
+  <go:docsCustomData xmlns:go="http://customooxmlschemas.google.com/" roundtripDataSignature="AMtx7mjDq9JnXPlAbddMLtLscb0KuXaYHg==">CgMxLjA4AHIhMTlFUFFvcW9Hck9XRU1qNTRlXzJ2RktPSndJMUp3RDdN</go:docsCustomData>
 </go:gDocsCustomXmlDataStorage>
 </file>
 

</xml_diff>